<commit_message>
docs(week8): laporan memakai nomor PR asli (#3, #4, #5) dan issue (#1, #2)
</commit_message>
<xml_diff>
--- a/08-week-8-mid-project-review/Laporan Jobsheet Minggu 8 - Adam Bahy Maulana.docx
+++ b/08-week-8-mid-project-review/Laporan Jobsheet Minggu 8 - Adam Bahy Maulana.docx
@@ -1010,7 +1010,7 @@
               <w:pStyle w:val="LaporanIsi"/>
             </w:pPr>
             <w:r>
-              <w:t xml:space="preserve">Tiga Pull Request kecil dibuka dari cabang masing-masing menuju develop. Tidak ada PR yang melebihi 300 baris perubahan.</w:t>
+              <w:t xml:space="preserve">Tiga Pull Request kecil dibuka dari cabang masing-masing menuju develop: PR #3, #4, dan #5. Tidak ada PR yang melebihi 300 baris perubahan.</w:t>
             </w:r>
           </w:p>
           <w:p>
@@ -1783,7 +1783,7 @@
                     <w:pStyle w:val="LaporanIsi"/>
                   </w:pPr>
                   <w:r>
-                    <w:t xml:space="preserve">Issue ditutup lewat kata kunci Closes pada badan PR, dan cabang dihapus setelah merge. Tidak ada PR berstatus request changes yang di-merge.</w:t>
+                    <w:t xml:space="preserve">Issue #1 dan #2 ditutup setelah merge, cabang dihapus, dan tautan PR dicatat di README. Tidak ada PR berstatus request changes yang di-merge.</w:t>
                   </w:r>
                 </w:p>
               </w:tc>

</xml_diff>